<commit_message>
files: refresh chipping-orchestrator details and add CV proposal
</commit_message>
<xml_diff>
--- a/file/CV_Geser_Dugarov.docx
+++ b/file/CV_Geser_Dugarov.docx
@@ -526,7 +526,55 @@
           <w:sz w:val="24"/>
           <w:szCs w:val="24"/>
         </w:rPr>
-        <w:t>, with 6,700+ agent runs recorded across 14 repositories.</w:t>
+        <w:t xml:space="preserve">, with </w:t>
+      </w:r>
+      <w:r>
+        <w:rPr>
+          <w:color w:val="000000"/>
+          <w:sz w:val="24"/>
+          <w:szCs w:val="24"/>
+        </w:rPr>
+        <w:t>8</w:t>
+      </w:r>
+      <w:r>
+        <w:rPr>
+          <w:color w:val="000000"/>
+          <w:sz w:val="24"/>
+          <w:szCs w:val="24"/>
+        </w:rPr>
+        <w:t>,</w:t>
+      </w:r>
+      <w:r>
+        <w:rPr>
+          <w:color w:val="000000"/>
+          <w:sz w:val="24"/>
+          <w:szCs w:val="24"/>
+        </w:rPr>
+        <w:t>4</w:t>
+      </w:r>
+      <w:r>
+        <w:rPr>
+          <w:color w:val="000000"/>
+          <w:sz w:val="24"/>
+          <w:szCs w:val="24"/>
+        </w:rPr>
+        <w:t>00+ agent runs recorded across 1</w:t>
+      </w:r>
+      <w:r>
+        <w:rPr>
+          <w:color w:val="000000"/>
+          <w:sz w:val="24"/>
+          <w:szCs w:val="24"/>
+        </w:rPr>
+        <w:t>5</w:t>
+      </w:r>
+      <w:r>
+        <w:rPr>
+          <w:color w:val="000000"/>
+          <w:sz w:val="24"/>
+          <w:szCs w:val="24"/>
+        </w:rPr>
+        <w:t xml:space="preserve"> repositories.</w:t>
       </w:r>
     </w:p>
     <w:p>
@@ -843,7 +891,21 @@
           <w:sz w:val="24"/>
           <w:szCs w:val="24"/>
         </w:rPr>
-        <w:t xml:space="preserve">: Codex, Claude Code, multi-agent orchestration, </w:t>
+        <w:t>: Codex, Claude Code, multi-agent orchestration,</w:t>
+      </w:r>
+      <w:r>
+        <w:rPr>
+          <w:sz w:val="24"/>
+          <w:szCs w:val="24"/>
+        </w:rPr>
+        <w:t xml:space="preserve"> task decomposition,</w:t>
+      </w:r>
+      <w:r>
+        <w:rPr>
+          <w:sz w:val="24"/>
+          <w:szCs w:val="24"/>
+        </w:rPr>
+        <w:t xml:space="preserve"> </w:t>
       </w:r>
       <w:r>
         <w:rPr>
@@ -878,7 +940,21 @@
           <w:sz w:val="24"/>
           <w:szCs w:val="24"/>
         </w:rPr>
-        <w:t>durable state/recovery, trajectory tracing, cost analytics</w:t>
+        <w:t>durable state/recovery,</w:t>
+      </w:r>
+      <w:r>
+        <w:rPr>
+          <w:sz w:val="24"/>
+          <w:szCs w:val="24"/>
+        </w:rPr>
+        <w:t xml:space="preserve"> run budgets,</w:t>
+      </w:r>
+      <w:r>
+        <w:rPr>
+          <w:sz w:val="24"/>
+          <w:szCs w:val="24"/>
+        </w:rPr>
+        <w:t xml:space="preserve"> trajectory tracing, cost analytics</w:t>
       </w:r>
     </w:p>
     <w:p>
@@ -1379,158 +1455,6 @@
     </w:p>
     <w:p>
       <w:pPr>
-        <w:pBdr>
-          <w:top w:val="nil"/>
-          <w:left w:val="nil"/>
-          <w:bottom w:val="nil"/>
-          <w:right w:val="nil"/>
-          <w:between w:val="nil"/>
-        </w:pBdr>
-        <w:spacing w:before="60" w:after="60" w:line="264" w:lineRule="auto"/>
-        <w:ind w:left="170" w:hanging="170"/>
-        <w:jc w:val="both"/>
-        <w:rPr>
-          <w:sz w:val="24"/>
-          <w:szCs w:val="24"/>
-        </w:rPr>
-      </w:pPr>
-      <w:r>
-        <w:rPr>
-          <w:sz w:val="24"/>
-          <w:szCs w:val="24"/>
-        </w:rPr>
-        <w:t>• </w:t>
-      </w:r>
-      <w:r>
-        <w:rPr>
-          <w:sz w:val="24"/>
-          <w:szCs w:val="24"/>
-        </w:rPr>
-        <w:t xml:space="preserve">Four additional Flink optimizations </w:t>
-      </w:r>
-      <w:r>
-        <w:rPr>
-          <w:sz w:val="24"/>
-          <w:szCs w:val="24"/>
-        </w:rPr>
-        <w:t>(</w:t>
-      </w:r>
-      <w:hyperlink r:id="rId20" w:history="1">
-        <w:r>
-          <w:rPr>
-            <w:rStyle w:val="Hyperlink"/>
-            <w:sz w:val="24"/>
-            <w:szCs w:val="24"/>
-          </w:rPr>
-          <w:t>[1]</w:t>
-        </w:r>
-      </w:hyperlink>
-      <w:r>
-        <w:rPr>
-          <w:sz w:val="24"/>
-          <w:szCs w:val="24"/>
-        </w:rPr>
-        <w:t xml:space="preserve">, </w:t>
-      </w:r>
-      <w:hyperlink r:id="rId21" w:history="1">
-        <w:r>
-          <w:rPr>
-            <w:rStyle w:val="Hyperlink"/>
-            <w:sz w:val="24"/>
-            <w:szCs w:val="24"/>
-          </w:rPr>
-          <w:t>[2]</w:t>
-        </w:r>
-      </w:hyperlink>
-      <w:r>
-        <w:rPr>
-          <w:sz w:val="24"/>
-          <w:szCs w:val="24"/>
-        </w:rPr>
-        <w:t xml:space="preserve">, </w:t>
-      </w:r>
-      <w:hyperlink r:id="rId22" w:history="1">
-        <w:r>
-          <w:rPr>
-            <w:rStyle w:val="Hyperlink"/>
-            <w:sz w:val="24"/>
-            <w:szCs w:val="24"/>
-          </w:rPr>
-          <w:t>[3]</w:t>
-        </w:r>
-      </w:hyperlink>
-      <w:r>
-        <w:rPr>
-          <w:sz w:val="24"/>
-          <w:szCs w:val="24"/>
-        </w:rPr>
-        <w:t>,</w:t>
-      </w:r>
-      <w:r>
-        <w:rPr>
-          <w:sz w:val="24"/>
-          <w:szCs w:val="24"/>
-        </w:rPr>
-        <w:t xml:space="preserve"> and</w:t>
-      </w:r>
-      <w:r>
-        <w:rPr>
-          <w:sz w:val="24"/>
-          <w:szCs w:val="24"/>
-        </w:rPr>
-        <w:t xml:space="preserve"> </w:t>
-      </w:r>
-      <w:hyperlink r:id="rId23" w:history="1">
-        <w:r>
-          <w:rPr>
-            <w:rStyle w:val="Hyperlink"/>
-            <w:sz w:val="24"/>
-            <w:szCs w:val="24"/>
-          </w:rPr>
-          <w:t>[4]</w:t>
-        </w:r>
-      </w:hyperlink>
-      <w:r>
-        <w:rPr>
-          <w:sz w:val="24"/>
-          <w:szCs w:val="24"/>
-        </w:rPr>
-        <w:t>)</w:t>
-      </w:r>
-      <w:r>
-        <w:rPr>
-          <w:sz w:val="24"/>
-          <w:szCs w:val="24"/>
-        </w:rPr>
-        <w:t xml:space="preserve"> </w:t>
-      </w:r>
-      <w:r>
-        <w:rPr>
-          <w:sz w:val="24"/>
-          <w:szCs w:val="24"/>
-        </w:rPr>
-        <w:t xml:space="preserve">improved throughput by 10% and reduced GC overhead by 30%; released in </w:t>
-      </w:r>
-      <w:hyperlink r:id="rId24" w:history="1">
-        <w:r>
-          <w:rPr>
-            <w:rStyle w:val="Hyperlink"/>
-            <w:sz w:val="24"/>
-            <w:szCs w:val="24"/>
-          </w:rPr>
-          <w:t>Hudi 1.0.1</w:t>
-        </w:r>
-      </w:hyperlink>
-      <w:r>
-        <w:rPr>
-          <w:sz w:val="24"/>
-          <w:szCs w:val="24"/>
-        </w:rPr>
-        <w:t>.</w:t>
-      </w:r>
-    </w:p>
-    <w:p>
-      <w:pPr>
         <w:keepNext/>
         <w:pBdr>
           <w:top w:val="nil"/>
@@ -1558,6 +1482,158 @@
         </w:rPr>
         <w:lastRenderedPageBreak/>
         <w:t>Huawei — continued</w:t>
+      </w:r>
+    </w:p>
+    <w:p>
+      <w:pPr>
+        <w:pBdr>
+          <w:top w:val="nil"/>
+          <w:left w:val="nil"/>
+          <w:bottom w:val="nil"/>
+          <w:right w:val="nil"/>
+          <w:between w:val="nil"/>
+        </w:pBdr>
+        <w:spacing w:before="60" w:after="60" w:line="264" w:lineRule="auto"/>
+        <w:ind w:left="170" w:hanging="170"/>
+        <w:jc w:val="both"/>
+        <w:rPr>
+          <w:sz w:val="24"/>
+          <w:szCs w:val="24"/>
+        </w:rPr>
+      </w:pPr>
+      <w:r>
+        <w:rPr>
+          <w:sz w:val="24"/>
+          <w:szCs w:val="24"/>
+        </w:rPr>
+        <w:t>• </w:t>
+      </w:r>
+      <w:r>
+        <w:rPr>
+          <w:sz w:val="24"/>
+          <w:szCs w:val="24"/>
+        </w:rPr>
+        <w:t xml:space="preserve">Four additional Flink optimizations </w:t>
+      </w:r>
+      <w:r>
+        <w:rPr>
+          <w:sz w:val="24"/>
+          <w:szCs w:val="24"/>
+        </w:rPr>
+        <w:t>(</w:t>
+      </w:r>
+      <w:hyperlink r:id="rId20" w:history="1">
+        <w:r>
+          <w:rPr>
+            <w:rStyle w:val="Hyperlink"/>
+            <w:sz w:val="24"/>
+            <w:szCs w:val="24"/>
+          </w:rPr>
+          <w:t>[1]</w:t>
+        </w:r>
+      </w:hyperlink>
+      <w:r>
+        <w:rPr>
+          <w:sz w:val="24"/>
+          <w:szCs w:val="24"/>
+        </w:rPr>
+        <w:t xml:space="preserve">, </w:t>
+      </w:r>
+      <w:hyperlink r:id="rId21" w:history="1">
+        <w:r>
+          <w:rPr>
+            <w:rStyle w:val="Hyperlink"/>
+            <w:sz w:val="24"/>
+            <w:szCs w:val="24"/>
+          </w:rPr>
+          <w:t>[2]</w:t>
+        </w:r>
+      </w:hyperlink>
+      <w:r>
+        <w:rPr>
+          <w:sz w:val="24"/>
+          <w:szCs w:val="24"/>
+        </w:rPr>
+        <w:t xml:space="preserve">, </w:t>
+      </w:r>
+      <w:hyperlink r:id="rId22" w:history="1">
+        <w:r>
+          <w:rPr>
+            <w:rStyle w:val="Hyperlink"/>
+            <w:sz w:val="24"/>
+            <w:szCs w:val="24"/>
+          </w:rPr>
+          <w:t>[3]</w:t>
+        </w:r>
+      </w:hyperlink>
+      <w:r>
+        <w:rPr>
+          <w:sz w:val="24"/>
+          <w:szCs w:val="24"/>
+        </w:rPr>
+        <w:t>,</w:t>
+      </w:r>
+      <w:r>
+        <w:rPr>
+          <w:sz w:val="24"/>
+          <w:szCs w:val="24"/>
+        </w:rPr>
+        <w:t xml:space="preserve"> and</w:t>
+      </w:r>
+      <w:r>
+        <w:rPr>
+          <w:sz w:val="24"/>
+          <w:szCs w:val="24"/>
+        </w:rPr>
+        <w:t xml:space="preserve"> </w:t>
+      </w:r>
+      <w:hyperlink r:id="rId23" w:history="1">
+        <w:r>
+          <w:rPr>
+            <w:rStyle w:val="Hyperlink"/>
+            <w:sz w:val="24"/>
+            <w:szCs w:val="24"/>
+          </w:rPr>
+          <w:t>[4]</w:t>
+        </w:r>
+      </w:hyperlink>
+      <w:r>
+        <w:rPr>
+          <w:sz w:val="24"/>
+          <w:szCs w:val="24"/>
+        </w:rPr>
+        <w:t>)</w:t>
+      </w:r>
+      <w:r>
+        <w:rPr>
+          <w:sz w:val="24"/>
+          <w:szCs w:val="24"/>
+        </w:rPr>
+        <w:t xml:space="preserve"> </w:t>
+      </w:r>
+      <w:r>
+        <w:rPr>
+          <w:sz w:val="24"/>
+          <w:szCs w:val="24"/>
+        </w:rPr>
+        <w:t xml:space="preserve">improved throughput by 10% and reduced GC overhead by 30%; released in </w:t>
+      </w:r>
+      <w:hyperlink r:id="rId24" w:history="1">
+        <w:r>
+          <w:rPr>
+            <w:rStyle w:val="Hyperlink"/>
+            <w:sz w:val="24"/>
+            <w:szCs w:val="24"/>
+          </w:rPr>
+          <w:t>Hudi 1.0.1</w:t>
+        </w:r>
+      </w:hyperlink>
+      <w:r>
+        <w:rPr>
+          <w:sz w:val="24"/>
+          <w:szCs w:val="24"/>
+        </w:rPr>
+        <w:t>.</w:t>
       </w:r>
     </w:p>
     <w:p>
@@ -1981,7 +2057,7 @@
             <w:sz w:val="24"/>
             <w:szCs w:val="24"/>
           </w:rPr>
-          <w:t>Agent Orchestrator</w:t>
+          <w:t>chipping-orchestrator</w:t>
         </w:r>
       </w:hyperlink>
       <w:r>
@@ -2046,7 +2122,71 @@
           <w:sz w:val="24"/>
           <w:szCs w:val="24"/>
         </w:rPr>
-        <w:t>Designed and shipped a Python issue-to-PR platform that orchestrates isolated implementation, automated validation, independent review, and human-controlled merge using Codex and Claude Code.</w:t>
+        <w:t xml:space="preserve">Designed and shipped a Python issue-to-PR platform </w:t>
+      </w:r>
+      <w:r>
+        <w:rPr>
+          <w:color w:val="000000"/>
+          <w:sz w:val="24"/>
+          <w:szCs w:val="24"/>
+        </w:rPr>
+        <w:t>using Codex and Claude Code,</w:t>
+      </w:r>
+      <w:r>
+        <w:rPr>
+          <w:color w:val="000000"/>
+          <w:sz w:val="24"/>
+          <w:szCs w:val="24"/>
+        </w:rPr>
+        <w:t xml:space="preserve"> with task decomposition, </w:t>
+      </w:r>
+      <w:r>
+        <w:rPr>
+          <w:color w:val="000000"/>
+          <w:sz w:val="24"/>
+          <w:szCs w:val="24"/>
+        </w:rPr>
+        <w:t xml:space="preserve">isolated </w:t>
+      </w:r>
+      <w:r>
+        <w:rPr>
+          <w:color w:val="000000"/>
+          <w:sz w:val="24"/>
+          <w:szCs w:val="24"/>
+        </w:rPr>
+        <w:t>worktrees</w:t>
+      </w:r>
+      <w:r>
+        <w:rPr>
+          <w:color w:val="000000"/>
+          <w:sz w:val="24"/>
+          <w:szCs w:val="24"/>
+        </w:rPr>
+        <w:t xml:space="preserve">, automated </w:t>
+      </w:r>
+      <w:r>
+        <w:rPr>
+          <w:color w:val="000000"/>
+          <w:sz w:val="24"/>
+          <w:szCs w:val="24"/>
+        </w:rPr>
+        <w:t>verification</w:t>
+      </w:r>
+      <w:r>
+        <w:rPr>
+          <w:color w:val="000000"/>
+          <w:sz w:val="24"/>
+          <w:szCs w:val="24"/>
+        </w:rPr>
+        <w:t>, independent review, and human-controlled merge.</w:t>
+      </w:r>
+      <w:r>
+        <w:rPr>
+          <w:color w:val="000000"/>
+          <w:sz w:val="24"/>
+          <w:szCs w:val="24"/>
+        </w:rPr>
+        <w:t xml:space="preserve"> Operated it across 15 repositories, recording 8,400+ agent runs, including 2,700+ review-agent runs.</w:t>
       </w:r>
     </w:p>
     <w:p>
@@ -2080,7 +2220,47 @@
           <w:sz w:val="24"/>
           <w:szCs w:val="24"/>
         </w:rPr>
-        <w:t>Built durable GitHub-persisted workflow state, pause/resume and recovery, credential isolation, audit/trajectory logging, and PostgreSQL cost analytics.</w:t>
+        <w:t xml:space="preserve">Built durable GitHub-persisted workflow state, pause/resume and </w:t>
+      </w:r>
+      <w:r>
+        <w:rPr>
+          <w:color w:val="000000"/>
+          <w:sz w:val="24"/>
+          <w:szCs w:val="24"/>
+        </w:rPr>
+        <w:t xml:space="preserve">crash </w:t>
+      </w:r>
+      <w:r>
+        <w:rPr>
+          <w:color w:val="000000"/>
+          <w:sz w:val="24"/>
+          <w:szCs w:val="24"/>
+        </w:rPr>
+        <w:t xml:space="preserve">recovery, credential isolation, </w:t>
+      </w:r>
+      <w:r>
+        <w:rPr>
+          <w:color w:val="000000"/>
+          <w:sz w:val="24"/>
+          <w:szCs w:val="24"/>
+        </w:rPr>
+        <w:t>cumulative PR-size limits, per-issue lifetime run budgets, and</w:t>
+      </w:r>
+      <w:r>
+        <w:rPr>
+          <w:color w:val="000000"/>
+          <w:sz w:val="24"/>
+          <w:szCs w:val="24"/>
+        </w:rPr>
+        <w:t xml:space="preserve"> human </w:t>
+      </w:r>
+      <w:r>
+        <w:rPr>
+          <w:color w:val="000000"/>
+          <w:sz w:val="24"/>
+          <w:szCs w:val="24"/>
+        </w:rPr>
+        <w:t>authorization for oversized changes; added trajectory tracing and</w:t>
       </w:r>
       <w:r>
         <w:rPr>
@@ -2096,8 +2276,90 @@
           <w:sz w:val="24"/>
           <w:szCs w:val="24"/>
         </w:rPr>
-        <w:t>Shipped 12 releases through v0.11.0 and recorded 6,700+ agent runs across 14 repositories, including 2,000+ independent review-agent runs</w:t>
-      </w:r>
+        <w:t>PostgreSQL</w:t>
+      </w:r>
+      <w:r>
+        <w:rPr>
+          <w:color w:val="000000"/>
+          <w:sz w:val="24"/>
+          <w:szCs w:val="24"/>
+        </w:rPr>
+        <w:t>/</w:t>
+      </w:r>
+      <w:r>
+        <w:rPr>
+          <w:color w:val="000000"/>
+          <w:sz w:val="24"/>
+          <w:szCs w:val="24"/>
+        </w:rPr>
+        <w:t>Streamlit</w:t>
+      </w:r>
+      <w:r>
+        <w:rPr>
+          <w:color w:val="000000"/>
+          <w:sz w:val="24"/>
+          <w:szCs w:val="24"/>
+        </w:rPr>
+        <w:t xml:space="preserve"> cost analytics.</w:t>
+      </w:r>
+      <w:r>
+        <w:rPr>
+          <w:color w:val="000000"/>
+          <w:sz w:val="24"/>
+          <w:szCs w:val="24"/>
+        </w:rPr>
+        <w:t xml:space="preserve"> </w:t>
+      </w:r>
+      <w:r>
+        <w:rPr>
+          <w:color w:val="000000"/>
+          <w:sz w:val="24"/>
+          <w:szCs w:val="24"/>
+        </w:rPr>
+        <w:t>Shipped 1</w:t>
+      </w:r>
+      <w:r>
+        <w:rPr>
+          <w:color w:val="000000"/>
+          <w:sz w:val="24"/>
+          <w:szCs w:val="24"/>
+        </w:rPr>
+        <w:t>4 </w:t>
+      </w:r>
+      <w:r>
+        <w:rPr>
+          <w:color w:val="000000"/>
+          <w:sz w:val="24"/>
+          <w:szCs w:val="24"/>
+        </w:rPr>
+        <w:t xml:space="preserve">releases through </w:t>
+      </w:r>
+      <w:hyperlink r:id="rId28" w:history="1">
+        <w:r>
+          <w:rPr>
+            <w:rStyle w:val="Hyperlink"/>
+            <w:sz w:val="24"/>
+            <w:szCs w:val="24"/>
+          </w:rPr>
+          <w:t>v0.1</w:t>
+        </w:r>
+        <w:r>
+          <w:rPr>
+            <w:rStyle w:val="Hyperlink"/>
+            <w:sz w:val="24"/>
+            <w:szCs w:val="24"/>
+          </w:rPr>
+          <w:t>2</w:t>
+        </w:r>
+        <w:r>
+          <w:rPr>
+            <w:rStyle w:val="Hyperlink"/>
+            <w:sz w:val="24"/>
+            <w:szCs w:val="24"/>
+          </w:rPr>
+          <w:t>.0</w:t>
+        </w:r>
+      </w:hyperlink>
       <w:r>
         <w:rPr>
           <w:sz w:val="24"/>
@@ -2260,7 +2522,7 @@
       </w:pPr>
     </w:p>
     <w:sectPr>
-      <w:footerReference w:type="default" r:id="rId28"/>
+      <w:footerReference w:type="default" r:id="rId29"/>
       <w:pgSz w:w="11906" w:h="16838"/>
       <w:pgMar w:top="851" w:right="1134" w:bottom="851" w:left="1134" w:header="113" w:footer="113" w:gutter="0"/>
       <w:pgNumType w:start="1"/>
@@ -3471,28 +3733,28 @@
 </file>
 
 <file path=customXml/item1.xml><?xml version="1.0" encoding="utf-8"?>
+<b:Sources xmlns:b="http://schemas.openxmlformats.org/officeDocument/2006/bibliography" xmlns="http://schemas.openxmlformats.org/officeDocument/2006/bibliography" SelectedStyle="\APASixthEditionOfficeOnline.xsl" StyleName="APA" Version="6"/>
+</file>
+
+<file path=customXml/item2.xml><?xml version="1.0" encoding="utf-8"?>
 <go:gDocsCustomXmlDataStorage xmlns:go="http://customooxmlschemas.google.com/" xmlns:r="http://schemas.openxmlformats.org/officeDocument/2006/relationships" uri="GoogleDocsCustomDataVersion1">
   <go:docsCustomData xmlns:go="http://customooxmlschemas.google.com/" roundtripDataSignature="AMtx7mj2rTb+yMeO4ZMzCURrmQEoHUAEOg==">AMUW2mVUHfnkjsQ3g9IAbbKsWnHRkQbFRrKBhaW9S9FG3DIMUMKv0i3cW0JaRsTPTPJriXnXfyvKgstmRDvrMQswBojz39J0hEpr3EAYRRH90zg0/FIM9NIWInX1rDP895QgQlMDPN+Iq23pAtsgeLN0/u0hEWS4PQ==</go:docsCustomData>
 </go:gDocsCustomXmlDataStorage>
 </file>
 
-<file path=customXml/item2.xml><?xml version="1.0" encoding="utf-8"?>
-<b:Sources xmlns:b="http://schemas.openxmlformats.org/officeDocument/2006/bibliography" xmlns="http://schemas.openxmlformats.org/officeDocument/2006/bibliography" SelectedStyle="\APASixthEditionOfficeOnline.xsl" StyleName="APA" Version="6"/>
+<file path=customXml/itemProps1.xml><?xml version="1.0" encoding="utf-8"?>
+<ds:datastoreItem xmlns:ds="http://schemas.openxmlformats.org/officeDocument/2006/customXml" ds:itemID="{C64B05CF-B518-47F3-B902-78DE0ADF0487}">
+  <ds:schemaRefs>
+    <ds:schemaRef ds:uri="http://schemas.openxmlformats.org/officeDocument/2006/bibliography"/>
+  </ds:schemaRefs>
+</ds:datastoreItem>
 </file>
 
-<file path=customXml/itemProps1.xml><?xml version="1.0" encoding="utf-8"?>
+<file path=customXml/itemProps2.xml><?xml version="1.0" encoding="utf-8"?>
 <ds:datastoreItem xmlns:ds="http://schemas.openxmlformats.org/officeDocument/2006/customXml" ds:itemID="{11111111-1234-1234-1234-123412341234}">
   <ds:schemaRefs>
     <ds:schemaRef ds:uri="http://customooxmlschemas.google.com/"/>
     <ds:schemaRef ds:uri="http://schemas.openxmlformats.org/officeDocument/2006/relationships"/>
   </ds:schemaRefs>
 </ds:datastoreItem>
-</file>
-
-<file path=customXml/itemProps2.xml><?xml version="1.0" encoding="utf-8"?>
-<ds:datastoreItem xmlns:ds="http://schemas.openxmlformats.org/officeDocument/2006/customXml" ds:itemID="{C64B05CF-B518-47F3-B902-78DE0ADF0487}">
-  <ds:schemaRefs>
-    <ds:schemaRef ds:uri="http://schemas.openxmlformats.org/officeDocument/2006/bibliography"/>
-  </ds:schemaRefs>
-</ds:datastoreItem>
 </file>
</xml_diff>

<commit_message>
files: refresh chipping-orchestrator details for v0.13.0
</commit_message>
<xml_diff>
--- a/file/CV_Geser_Dugarov.docx
+++ b/file/CV_Geser_Dugarov.docx
@@ -508,7 +508,25 @@
           <w:sz w:val="24"/>
           <w:szCs w:val="24"/>
         </w:rPr>
-        <w:t xml:space="preserve">Creator and operator of open-source </w:t>
+        <w:t xml:space="preserve">Creator and operator of </w:t>
+      </w:r>
+      <w:proofErr w:type="gramStart"/>
+      <w:r>
+        <w:rPr>
+          <w:color w:val="000000"/>
+          <w:sz w:val="24"/>
+          <w:szCs w:val="24"/>
+        </w:rPr>
+        <w:t>open-source</w:t>
+      </w:r>
+      <w:proofErr w:type="gramEnd"/>
+      <w:r>
+        <w:rPr>
+          <w:color w:val="000000"/>
+          <w:sz w:val="24"/>
+          <w:szCs w:val="24"/>
+        </w:rPr>
+        <w:t xml:space="preserve"> </w:t>
       </w:r>
       <w:hyperlink r:id="rId13" w:history="1">
         <w:r>
@@ -526,55 +544,33 @@
           <w:sz w:val="24"/>
           <w:szCs w:val="24"/>
         </w:rPr>
-        <w:t xml:space="preserve">, with </w:t>
-      </w:r>
-      <w:r>
-        <w:rPr>
-          <w:color w:val="000000"/>
-          <w:sz w:val="24"/>
-          <w:szCs w:val="24"/>
-        </w:rPr>
-        <w:t>8</w:t>
-      </w:r>
-      <w:r>
-        <w:rPr>
-          <w:color w:val="000000"/>
-          <w:sz w:val="24"/>
-          <w:szCs w:val="24"/>
-        </w:rPr>
-        <w:t>,</w:t>
-      </w:r>
-      <w:r>
-        <w:rPr>
-          <w:color w:val="000000"/>
-          <w:sz w:val="24"/>
-          <w:szCs w:val="24"/>
-        </w:rPr>
-        <w:t>4</w:t>
-      </w:r>
-      <w:r>
-        <w:rPr>
-          <w:color w:val="000000"/>
-          <w:sz w:val="24"/>
-          <w:szCs w:val="24"/>
-        </w:rPr>
-        <w:t>00+ agent runs recorded across 1</w:t>
-      </w:r>
-      <w:r>
-        <w:rPr>
-          <w:color w:val="000000"/>
-          <w:sz w:val="24"/>
-          <w:szCs w:val="24"/>
-        </w:rPr>
-        <w:t>5</w:t>
-      </w:r>
-      <w:r>
-        <w:rPr>
-          <w:color w:val="000000"/>
-          <w:sz w:val="24"/>
-          <w:szCs w:val="24"/>
-        </w:rPr>
-        <w:t xml:space="preserve"> repositories.</w:t>
+        <w:t xml:space="preserve">, published on </w:t>
+      </w:r>
+      <w:proofErr w:type="spellStart"/>
+      <w:r>
+        <w:rPr>
+          <w:color w:val="000000"/>
+          <w:sz w:val="24"/>
+          <w:szCs w:val="24"/>
+        </w:rPr>
+        <w:t>PyPI</w:t>
+      </w:r>
+      <w:proofErr w:type="spellEnd"/>
+      <w:r>
+        <w:rPr>
+          <w:color w:val="000000"/>
+          <w:sz w:val="24"/>
+          <w:szCs w:val="24"/>
+        </w:rPr>
+        <w:t xml:space="preserve"> with independent review and verification evidence</w:t>
+      </w:r>
+      <w:r>
+        <w:rPr>
+          <w:color w:val="000000"/>
+          <w:sz w:val="24"/>
+          <w:szCs w:val="24"/>
+        </w:rPr>
+        <w:t>.</w:t>
       </w:r>
     </w:p>
     <w:p>
@@ -891,70 +887,14 @@
           <w:sz w:val="24"/>
           <w:szCs w:val="24"/>
         </w:rPr>
-        <w:t>: Codex, Claude Code, multi-agent orchestration,</w:t>
-      </w:r>
-      <w:r>
-        <w:rPr>
-          <w:sz w:val="24"/>
-          <w:szCs w:val="24"/>
-        </w:rPr>
-        <w:t xml:space="preserve"> task decomposition,</w:t>
-      </w:r>
-      <w:r>
-        <w:rPr>
-          <w:sz w:val="24"/>
-          <w:szCs w:val="24"/>
-        </w:rPr>
-        <w:t xml:space="preserve"> </w:t>
-      </w:r>
-      <w:r>
-        <w:rPr>
-          <w:sz w:val="24"/>
-          <w:szCs w:val="24"/>
-        </w:rPr>
-        <w:t>human-in-the-loop (</w:t>
-      </w:r>
-      <w:r>
-        <w:rPr>
-          <w:sz w:val="24"/>
-          <w:szCs w:val="24"/>
-        </w:rPr>
-        <w:t>HITL</w:t>
-      </w:r>
-      <w:r>
-        <w:rPr>
-          <w:sz w:val="24"/>
-          <w:szCs w:val="24"/>
-        </w:rPr>
-        <w:t>)</w:t>
-      </w:r>
-      <w:r>
-        <w:rPr>
-          <w:sz w:val="24"/>
-          <w:szCs w:val="24"/>
-        </w:rPr>
-        <w:t xml:space="preserve"> workflows, </w:t>
-      </w:r>
-      <w:r>
-        <w:rPr>
-          <w:sz w:val="24"/>
-          <w:szCs w:val="24"/>
-        </w:rPr>
-        <w:t>durable state/recovery,</w:t>
-      </w:r>
-      <w:r>
-        <w:rPr>
-          <w:sz w:val="24"/>
-          <w:szCs w:val="24"/>
-        </w:rPr>
-        <w:t xml:space="preserve"> run budgets,</w:t>
-      </w:r>
-      <w:r>
-        <w:rPr>
-          <w:sz w:val="24"/>
-          <w:szCs w:val="24"/>
-        </w:rPr>
-        <w:t xml:space="preserve"> trajectory tracing, cost analytics</w:t>
+        <w:t xml:space="preserve">: </w:t>
+      </w:r>
+      <w:r>
+        <w:rPr>
+          <w:sz w:val="24"/>
+          <w:szCs w:val="24"/>
+        </w:rPr>
+        <w:t>Codex, Claude Code, Antigravity, multi-agent orchestration, task decomposition, human-in-the-loop (HITL) workflows, verification evidence, durable state/recovery, run budgets, trajectory tracing, cost analytics</w:t>
       </w:r>
     </w:p>
     <w:p>
@@ -1029,7 +969,28 @@
           <w:sz w:val="24"/>
           <w:szCs w:val="24"/>
         </w:rPr>
-        <w:t>release engineering, Maven, Docker, Linux</w:t>
+        <w:t xml:space="preserve">release engineering, Maven, </w:t>
+      </w:r>
+      <w:r>
+        <w:rPr>
+          <w:sz w:val="24"/>
+          <w:szCs w:val="24"/>
+        </w:rPr>
+        <w:t>Poetry</w:t>
+      </w:r>
+      <w:r>
+        <w:rPr>
+          <w:sz w:val="24"/>
+          <w:szCs w:val="24"/>
+        </w:rPr>
+        <w:t xml:space="preserve">, </w:t>
+      </w:r>
+      <w:r>
+        <w:rPr>
+          <w:sz w:val="24"/>
+          <w:szCs w:val="24"/>
+        </w:rPr>
+        <w:t>Docker, Linux</w:t>
       </w:r>
     </w:p>
     <w:p>
@@ -1248,7 +1209,25 @@
           <w:sz w:val="24"/>
           <w:szCs w:val="24"/>
         </w:rPr>
-        <w:t>Develop core lakehouse, distributed data, and AI retrieval infrastructure for Huawei Cloud; support teammates through code and RFC reviews and technical tutorials.</w:t>
+        <w:t xml:space="preserve">Develop core lakehouse, distributed data, and AI retrieval infrastructure for Huawei </w:t>
+      </w:r>
+      <w:proofErr w:type="gramStart"/>
+      <w:r>
+        <w:rPr>
+          <w:color w:val="000000"/>
+          <w:sz w:val="24"/>
+          <w:szCs w:val="24"/>
+        </w:rPr>
+        <w:t>Cloud;</w:t>
+      </w:r>
+      <w:proofErr w:type="gramEnd"/>
+      <w:r>
+        <w:rPr>
+          <w:color w:val="000000"/>
+          <w:sz w:val="24"/>
+          <w:szCs w:val="24"/>
+        </w:rPr>
+        <w:t xml:space="preserve"> support teammates through code and RFC reviews and technical tutorials.</w:t>
       </w:r>
     </w:p>
     <w:p>
@@ -1280,7 +1259,23 @@
           <w:sz w:val="24"/>
           <w:szCs w:val="24"/>
         </w:rPr>
-        <w:t>Designed and implemented a two-tier distributed cache for Lance vector indices with an in-memory L1, persistent per-worker NVMe L2, and IVF-partition prewarming and routing; integrated it with Ray and benchmarked it on a real cluster.</w:t>
+        <w:t xml:space="preserve">Designed and implemented a two-tier distributed cache for Lance vector indices with an in-memory L1, persistent per-worker </w:t>
+      </w:r>
+      <w:proofErr w:type="spellStart"/>
+      <w:r>
+        <w:rPr>
+          <w:sz w:val="24"/>
+          <w:szCs w:val="24"/>
+        </w:rPr>
+        <w:t>NVMe</w:t>
+      </w:r>
+      <w:proofErr w:type="spellEnd"/>
+      <w:r>
+        <w:rPr>
+          <w:sz w:val="24"/>
+          <w:szCs w:val="24"/>
+        </w:rPr>
+        <w:t xml:space="preserve"> L2, and IVF-partition prewarming and routing; integrated it with Ray and benchmarked it on a real cluster.</w:t>
       </w:r>
     </w:p>
     <w:p>
@@ -1730,7 +1725,39 @@
           <w:sz w:val="24"/>
           <w:szCs w:val="24"/>
         </w:rPr>
-        <w:t xml:space="preserve">Drove Hudi’s Spark DataSource V2 migration; authored </w:t>
+        <w:t xml:space="preserve">Drove </w:t>
+      </w:r>
+      <w:proofErr w:type="spellStart"/>
+      <w:r>
+        <w:rPr>
+          <w:sz w:val="24"/>
+          <w:szCs w:val="24"/>
+        </w:rPr>
+        <w:t>Hudi’s</w:t>
+      </w:r>
+      <w:proofErr w:type="spellEnd"/>
+      <w:r>
+        <w:rPr>
+          <w:sz w:val="24"/>
+          <w:szCs w:val="24"/>
+        </w:rPr>
+        <w:t xml:space="preserve"> Spark </w:t>
+      </w:r>
+      <w:proofErr w:type="spellStart"/>
+      <w:r>
+        <w:rPr>
+          <w:sz w:val="24"/>
+          <w:szCs w:val="24"/>
+        </w:rPr>
+        <w:t>DataSource</w:t>
+      </w:r>
+      <w:proofErr w:type="spellEnd"/>
+      <w:r>
+        <w:rPr>
+          <w:sz w:val="24"/>
+          <w:szCs w:val="24"/>
+        </w:rPr>
+        <w:t xml:space="preserve"> V2 migration; authored </w:t>
       </w:r>
       <w:hyperlink r:id="rId25" w:history="1">
         <w:r>
@@ -2130,63 +2157,23 @@
           <w:sz w:val="24"/>
           <w:szCs w:val="24"/>
         </w:rPr>
-        <w:t>using Codex and Claude Code,</w:t>
-      </w:r>
-      <w:r>
-        <w:rPr>
-          <w:color w:val="000000"/>
-          <w:sz w:val="24"/>
-          <w:szCs w:val="24"/>
-        </w:rPr>
-        <w:t xml:space="preserve"> with task decomposition, </w:t>
-      </w:r>
-      <w:r>
-        <w:rPr>
-          <w:color w:val="000000"/>
-          <w:sz w:val="24"/>
-          <w:szCs w:val="24"/>
-        </w:rPr>
-        <w:t xml:space="preserve">isolated </w:t>
-      </w:r>
-      <w:r>
-        <w:rPr>
-          <w:color w:val="000000"/>
-          <w:sz w:val="24"/>
-          <w:szCs w:val="24"/>
-        </w:rPr>
-        <w:t>worktrees</w:t>
-      </w:r>
-      <w:r>
-        <w:rPr>
-          <w:color w:val="000000"/>
-          <w:sz w:val="24"/>
-          <w:szCs w:val="24"/>
-        </w:rPr>
-        <w:t xml:space="preserve">, automated </w:t>
-      </w:r>
-      <w:r>
-        <w:rPr>
-          <w:color w:val="000000"/>
-          <w:sz w:val="24"/>
-          <w:szCs w:val="24"/>
-        </w:rPr>
-        <w:t>verification</w:t>
-      </w:r>
-      <w:r>
-        <w:rPr>
-          <w:color w:val="000000"/>
-          <w:sz w:val="24"/>
-          <w:szCs w:val="24"/>
-        </w:rPr>
-        <w:t>, independent review, and human-controlled merge.</w:t>
-      </w:r>
-      <w:r>
-        <w:rPr>
-          <w:color w:val="000000"/>
-          <w:sz w:val="24"/>
-          <w:szCs w:val="24"/>
-        </w:rPr>
-        <w:t xml:space="preserve"> Operated it across 15 repositories, recording 8,400+ agent runs, including 2,700+ review-agent runs.</w:t>
+        <w:t xml:space="preserve">using </w:t>
+      </w:r>
+      <w:r>
+        <w:rPr>
+          <w:color w:val="000000"/>
+          <w:sz w:val="24"/>
+          <w:szCs w:val="24"/>
+        </w:rPr>
+        <w:t>Codex, Claude Code, and Antigravity, with task decomposition, isolated worktrees, automated verification, independent review, and human-controlled merge. Operated it across 15 repositories in personal use, recording 8,400+ agent runs, including 2,700+ review-agent runs</w:t>
+      </w:r>
+      <w:r>
+        <w:rPr>
+          <w:color w:val="000000"/>
+          <w:sz w:val="24"/>
+          <w:szCs w:val="24"/>
+        </w:rPr>
+        <w:t>.</w:t>
       </w:r>
     </w:p>
     <w:p>
@@ -2202,7 +2189,6 @@
         <w:ind w:left="170" w:hanging="170"/>
         <w:jc w:val="both"/>
         <w:rPr>
-          <w:color w:val="000000"/>
           <w:sz w:val="24"/>
           <w:szCs w:val="24"/>
         </w:rPr>
@@ -2220,72 +2206,9 @@
           <w:sz w:val="24"/>
           <w:szCs w:val="24"/>
         </w:rPr>
-        <w:t xml:space="preserve">Built durable GitHub-persisted workflow state, pause/resume and </w:t>
-      </w:r>
-      <w:r>
-        <w:rPr>
-          <w:color w:val="000000"/>
-          <w:sz w:val="24"/>
-          <w:szCs w:val="24"/>
-        </w:rPr>
-        <w:t xml:space="preserve">crash </w:t>
-      </w:r>
-      <w:r>
-        <w:rPr>
-          <w:color w:val="000000"/>
-          <w:sz w:val="24"/>
-          <w:szCs w:val="24"/>
-        </w:rPr>
-        <w:t xml:space="preserve">recovery, credential isolation, </w:t>
-      </w:r>
-      <w:r>
-        <w:rPr>
-          <w:color w:val="000000"/>
-          <w:sz w:val="24"/>
-          <w:szCs w:val="24"/>
-        </w:rPr>
-        <w:t>cumulative PR-size limits, per-issue lifetime run budgets, and</w:t>
-      </w:r>
-      <w:r>
-        <w:rPr>
-          <w:color w:val="000000"/>
-          <w:sz w:val="24"/>
-          <w:szCs w:val="24"/>
-        </w:rPr>
-        <w:t xml:space="preserve"> human </w:t>
-      </w:r>
-      <w:r>
-        <w:rPr>
-          <w:color w:val="000000"/>
-          <w:sz w:val="24"/>
-          <w:szCs w:val="24"/>
-        </w:rPr>
-        <w:t>authorization for oversized changes; added trajectory tracing and</w:t>
-      </w:r>
-      <w:r>
-        <w:rPr>
-          <w:color w:val="000000"/>
-          <w:sz w:val="24"/>
-          <w:szCs w:val="24"/>
-        </w:rPr>
-        <w:t xml:space="preserve"> </w:t>
-      </w:r>
-      <w:r>
-        <w:rPr>
-          <w:color w:val="000000"/>
-          <w:sz w:val="24"/>
-          <w:szCs w:val="24"/>
-        </w:rPr>
-        <w:t>PostgreSQL</w:t>
-      </w:r>
-      <w:r>
-        <w:rPr>
-          <w:color w:val="000000"/>
-          <w:sz w:val="24"/>
-          <w:szCs w:val="24"/>
-        </w:rPr>
-        <w:t>/</w:t>
-      </w:r>
+        <w:t>Built GitHub-visible workflow state with host-local coordination, pause/resume, trusted-comment filtering, and interrupted-run recovery; added PR-size limits, lifetime run budgets, human authorization for oversized changes, trajectory tracing, and PostgreSQL/</w:t>
+      </w:r>
+      <w:proofErr w:type="spellStart"/>
       <w:r>
         <w:rPr>
           <w:color w:val="000000"/>
@@ -2294,45 +2217,54 @@
         </w:rPr>
         <w:t>Streamlit</w:t>
       </w:r>
-      <w:r>
-        <w:rPr>
-          <w:color w:val="000000"/>
-          <w:sz w:val="24"/>
-          <w:szCs w:val="24"/>
-        </w:rPr>
-        <w:t xml:space="preserve"> cost analytics.</w:t>
-      </w:r>
-      <w:r>
-        <w:rPr>
-          <w:color w:val="000000"/>
-          <w:sz w:val="24"/>
-          <w:szCs w:val="24"/>
-        </w:rPr>
-        <w:t xml:space="preserve"> </w:t>
-      </w:r>
-      <w:r>
-        <w:rPr>
-          <w:color w:val="000000"/>
-          <w:sz w:val="24"/>
-          <w:szCs w:val="24"/>
-        </w:rPr>
-        <w:t>Shipped 1</w:t>
-      </w:r>
-      <w:r>
-        <w:rPr>
-          <w:color w:val="000000"/>
-          <w:sz w:val="24"/>
-          <w:szCs w:val="24"/>
-        </w:rPr>
-        <w:t>4 </w:t>
-      </w:r>
-      <w:r>
-        <w:rPr>
-          <w:color w:val="000000"/>
-          <w:sz w:val="24"/>
-          <w:szCs w:val="24"/>
-        </w:rPr>
-        <w:t xml:space="preserve">releases through </w:t>
+      <w:proofErr w:type="spellEnd"/>
+      <w:r>
+        <w:rPr>
+          <w:color w:val="000000"/>
+          <w:sz w:val="24"/>
+          <w:szCs w:val="24"/>
+        </w:rPr>
+        <w:t xml:space="preserve"> cost analytics. Bound reviewer approval to the current PR revision, requirements, developer report, and passing verification evidence</w:t>
+      </w:r>
+      <w:r>
+        <w:rPr>
+          <w:sz w:val="24"/>
+          <w:szCs w:val="24"/>
+        </w:rPr>
+        <w:t>.</w:t>
+      </w:r>
+    </w:p>
+    <w:p>
+      <w:pPr>
+        <w:pBdr>
+          <w:top w:val="nil"/>
+          <w:left w:val="nil"/>
+          <w:bottom w:val="nil"/>
+          <w:right w:val="nil"/>
+          <w:between w:val="nil"/>
+        </w:pBdr>
+        <w:spacing w:before="60" w:after="60" w:line="264" w:lineRule="auto"/>
+        <w:ind w:left="170" w:hanging="170"/>
+        <w:jc w:val="both"/>
+        <w:rPr>
+          <w:color w:val="000000"/>
+          <w:sz w:val="24"/>
+          <w:szCs w:val="24"/>
+        </w:rPr>
+      </w:pPr>
+      <w:r>
+        <w:rPr>
+          <w:sz w:val="24"/>
+          <w:szCs w:val="24"/>
+        </w:rPr>
+        <w:t>• </w:t>
+      </w:r>
+      <w:r>
+        <w:rPr>
+          <w:sz w:val="24"/>
+          <w:szCs w:val="24"/>
+        </w:rPr>
+        <w:t xml:space="preserve">Shipped 15 GitHub releases through </w:t>
       </w:r>
       <w:hyperlink r:id="rId28" w:history="1">
         <w:r>
@@ -2341,23 +2273,119 @@
             <w:sz w:val="24"/>
             <w:szCs w:val="24"/>
           </w:rPr>
-          <w:t>v0.1</w:t>
+          <w:t>v0.13.0</w:t>
         </w:r>
+      </w:hyperlink>
+      <w:r>
+        <w:rPr>
+          <w:sz w:val="24"/>
+          <w:szCs w:val="24"/>
+        </w:rPr>
+        <w:t xml:space="preserve"> (6 Oct 2026), also the first </w:t>
+      </w:r>
+      <w:hyperlink r:id="rId29" w:history="1">
+        <w:proofErr w:type="spellStart"/>
         <w:r>
           <w:rPr>
             <w:rStyle w:val="Hyperlink"/>
             <w:sz w:val="24"/>
             <w:szCs w:val="24"/>
           </w:rPr>
-          <w:t>2</w:t>
+          <w:t>PyPI</w:t>
         </w:r>
+        <w:proofErr w:type="spellEnd"/>
         <w:r>
           <w:rPr>
             <w:rStyle w:val="Hyperlink"/>
             <w:sz w:val="24"/>
             <w:szCs w:val="24"/>
           </w:rPr>
-          <w:t>.0</w:t>
+          <w:t xml:space="preserve"> package</w:t>
+        </w:r>
+      </w:hyperlink>
+      <w:r>
+        <w:rPr>
+          <w:sz w:val="24"/>
+          <w:szCs w:val="24"/>
+        </w:rPr>
+        <w:t xml:space="preserve">; added Poetry packaging, </w:t>
+      </w:r>
+      <w:hyperlink r:id="rId30" w:history="1">
+        <w:r>
+          <w:rPr>
+            <w:rStyle w:val="Hyperlink"/>
+            <w:sz w:val="24"/>
+            <w:szCs w:val="24"/>
+          </w:rPr>
+          <w:t>published documentation</w:t>
+        </w:r>
+      </w:hyperlink>
+      <w:r>
+        <w:rPr>
+          <w:sz w:val="24"/>
+          <w:szCs w:val="24"/>
+        </w:rPr>
+        <w:t>, and CI on Python 3.12–3.14. As of 13 Oct 2026: 1,068</w:t>
+      </w:r>
+      <w:r>
+        <w:rPr>
+          <w:sz w:val="24"/>
+          <w:szCs w:val="24"/>
+        </w:rPr>
+        <w:t> </w:t>
+      </w:r>
+      <w:r>
+        <w:rPr>
+          <w:sz w:val="24"/>
+          <w:szCs w:val="24"/>
+        </w:rPr>
+        <w:t xml:space="preserve">merged project PRs, </w:t>
+      </w:r>
+      <w:hyperlink r:id="rId31" w:history="1">
+        <w:proofErr w:type="spellStart"/>
+        <w:r>
+          <w:rPr>
+            <w:rStyle w:val="Hyperlink"/>
+            <w:sz w:val="24"/>
+            <w:szCs w:val="24"/>
+          </w:rPr>
+          <w:t>OpenSSF</w:t>
+        </w:r>
+        <w:proofErr w:type="spellEnd"/>
+        <w:r>
+          <w:rPr>
+            <w:rStyle w:val="Hyperlink"/>
+            <w:sz w:val="24"/>
+            <w:szCs w:val="24"/>
+          </w:rPr>
+          <w:t xml:space="preserve"> Scorecard</w:t>
+        </w:r>
+      </w:hyperlink>
+      <w:r>
+        <w:rPr>
+          <w:sz w:val="24"/>
+          <w:szCs w:val="24"/>
+        </w:rPr>
+        <w:t xml:space="preserve"> 8.6/10, and an </w:t>
+      </w:r>
+      <w:hyperlink r:id="rId32" w:history="1">
+        <w:proofErr w:type="spellStart"/>
+        <w:r>
+          <w:rPr>
+            <w:rStyle w:val="Hyperlink"/>
+            <w:sz w:val="24"/>
+            <w:szCs w:val="24"/>
+          </w:rPr>
+          <w:t>OpenSSF</w:t>
+        </w:r>
+        <w:proofErr w:type="spellEnd"/>
+        <w:r>
+          <w:rPr>
+            <w:rStyle w:val="Hyperlink"/>
+            <w:sz w:val="24"/>
+            <w:szCs w:val="24"/>
+          </w:rPr>
+          <w:t xml:space="preserve"> Best Practices Passing badge</w:t>
         </w:r>
       </w:hyperlink>
       <w:r>
@@ -2522,7 +2550,7 @@
       </w:pPr>
     </w:p>
     <w:sectPr>
-      <w:footerReference w:type="default" r:id="rId29"/>
+      <w:footerReference w:type="default" r:id="rId33"/>
       <w:pgSz w:w="11906" w:h="16838"/>
       <w:pgMar w:top="851" w:right="1134" w:bottom="851" w:left="1134" w:header="113" w:footer="113" w:gutter="0"/>
       <w:pgNumType w:start="1"/>
@@ -3105,7 +3133,6 @@
   <w:style w:type="character" w:default="1" w:styleId="DefaultParagraphFont">
     <w:name w:val="Default Paragraph Font"/>
     <w:uiPriority w:val="1"/>
-    <w:semiHidden/>
     <w:unhideWhenUsed/>
   </w:style>
   <w:style w:type="table" w:default="1" w:styleId="TableNormal">

</xml_diff>